<commit_message>
Update POIROT project documentation
Co-authored-by: Cursor <cursoragent@cursor.com>
</commit_message>
<xml_diff>
--- a/POIROT.docx
+++ b/POIROT.docx
@@ -555,7 +555,7 @@
           <w:rFonts w:ascii="Arial" w:hAnsi="Arial" w:cs="Arial"/>
         </w:rPr>
         <w:pict w14:anchorId="4DF1B70A">
-          <v:rect id="_x0000_i1253" style="width:0;height:1.5pt" o:hralign="center" o:hrstd="t" o:hr="t" fillcolor="#a0a0a0" stroked="f"/>
+          <v:rect id="_x0000_i1025" style="width:0;height:1.5pt" o:hralign="center" o:hrstd="t" o:hr="t" fillcolor="#a0a0a0" stroked="f"/>
         </w:pict>
       </w:r>
     </w:p>
@@ -910,7 +910,7 @@
           <w:rFonts w:ascii="Arial" w:hAnsi="Arial" w:cs="Arial"/>
         </w:rPr>
         <w:pict w14:anchorId="4D07E568">
-          <v:rect id="_x0000_i1254" style="width:0;height:1.5pt" o:hralign="center" o:hrstd="t" o:hr="t" fillcolor="#a0a0a0" stroked="f"/>
+          <v:rect id="_x0000_i1026" style="width:0;height:1.5pt" o:hralign="center" o:hrstd="t" o:hr="t" fillcolor="#a0a0a0" stroked="f"/>
         </w:pict>
       </w:r>
     </w:p>
@@ -1147,7 +1147,7 @@
           <w:rFonts w:ascii="Arial" w:hAnsi="Arial" w:cs="Arial"/>
         </w:rPr>
         <w:pict w14:anchorId="42F89A67">
-          <v:rect id="_x0000_i1255" style="width:0;height:1.5pt" o:hralign="center" o:hrstd="t" o:hr="t" fillcolor="#a0a0a0" stroked="f"/>
+          <v:rect id="_x0000_i1027" style="width:0;height:1.5pt" o:hralign="center" o:hrstd="t" o:hr="t" fillcolor="#a0a0a0" stroked="f"/>
         </w:pict>
       </w:r>
     </w:p>
@@ -1292,7 +1292,7 @@
           <w:rFonts w:ascii="Arial" w:hAnsi="Arial" w:cs="Arial"/>
         </w:rPr>
         <w:pict w14:anchorId="5648302B">
-          <v:rect id="_x0000_i1256" style="width:0;height:1.5pt" o:hralign="center" o:hrstd="t" o:hr="t" fillcolor="#a0a0a0" stroked="f"/>
+          <v:rect id="_x0000_i1028" style="width:0;height:1.5pt" o:hralign="center" o:hrstd="t" o:hr="t" fillcolor="#a0a0a0" stroked="f"/>
         </w:pict>
       </w:r>
     </w:p>
@@ -1385,7 +1385,7 @@
           <w:rFonts w:ascii="Arial" w:hAnsi="Arial" w:cs="Arial"/>
         </w:rPr>
         <w:pict w14:anchorId="2A6CB7CA">
-          <v:rect id="_x0000_i1257" style="width:0;height:1.5pt" o:hralign="center" o:hrstd="t" o:hr="t" fillcolor="#a0a0a0" stroked="f"/>
+          <v:rect id="_x0000_i1029" style="width:0;height:1.5pt" o:hralign="center" o:hrstd="t" o:hr="t" fillcolor="#a0a0a0" stroked="f"/>
         </w:pict>
       </w:r>
     </w:p>
@@ -1516,7 +1516,7 @@
           <w:rFonts w:ascii="Arial" w:hAnsi="Arial" w:cs="Arial"/>
         </w:rPr>
         <w:pict w14:anchorId="27D395E1">
-          <v:rect id="_x0000_i1258" style="width:0;height:1.5pt" o:hralign="center" o:hrstd="t" o:hr="t" fillcolor="#a0a0a0" stroked="f"/>
+          <v:rect id="_x0000_i1030" style="width:0;height:1.5pt" o:hralign="center" o:hrstd="t" o:hr="t" fillcolor="#a0a0a0" stroked="f"/>
         </w:pict>
       </w:r>
     </w:p>
@@ -1824,7 +1824,7 @@
           <w:rFonts w:ascii="Arial" w:hAnsi="Arial" w:cs="Arial"/>
         </w:rPr>
         <w:pict w14:anchorId="7B2995E0">
-          <v:rect id="_x0000_i1259" style="width:0;height:1.5pt" o:hralign="center" o:hrstd="t" o:hr="t" fillcolor="#a0a0a0" stroked="f"/>
+          <v:rect id="_x0000_i1031" style="width:0;height:1.5pt" o:hralign="center" o:hrstd="t" o:hr="t" fillcolor="#a0a0a0" stroked="f"/>
         </w:pict>
       </w:r>
     </w:p>
@@ -2154,7 +2154,7 @@
           <w:rFonts w:ascii="Arial" w:hAnsi="Arial" w:cs="Arial"/>
         </w:rPr>
         <w:pict w14:anchorId="0567BAF9">
-          <v:rect id="_x0000_i1260" style="width:0;height:1.5pt" o:hralign="center" o:hrstd="t" o:hr="t" fillcolor="#a0a0a0" stroked="f"/>
+          <v:rect id="_x0000_i1032" style="width:0;height:1.5pt" o:hralign="center" o:hrstd="t" o:hr="t" fillcolor="#a0a0a0" stroked="f"/>
         </w:pict>
       </w:r>
     </w:p>
@@ -2541,7 +2541,7 @@
           <w:rFonts w:ascii="Arial" w:hAnsi="Arial" w:cs="Arial"/>
         </w:rPr>
         <w:pict w14:anchorId="777C9B06">
-          <v:rect id="_x0000_i1261" style="width:0;height:1.5pt" o:hralign="center" o:hrstd="t" o:hr="t" fillcolor="#a0a0a0" stroked="f"/>
+          <v:rect id="_x0000_i1033" style="width:0;height:1.5pt" o:hralign="center" o:hrstd="t" o:hr="t" fillcolor="#a0a0a0" stroked="f"/>
         </w:pict>
       </w:r>
     </w:p>
@@ -2708,7 +2708,7 @@
           <w:rFonts w:ascii="Arial" w:hAnsi="Arial" w:cs="Arial"/>
         </w:rPr>
         <w:pict w14:anchorId="02543AB5">
-          <v:rect id="_x0000_i1262" style="width:0;height:1.5pt" o:hralign="center" o:hrstd="t" o:hr="t" fillcolor="#a0a0a0" stroked="f"/>
+          <v:rect id="_x0000_i1034" style="width:0;height:1.5pt" o:hralign="center" o:hrstd="t" o:hr="t" fillcolor="#a0a0a0" stroked="f"/>
         </w:pict>
       </w:r>
     </w:p>
@@ -2951,7 +2951,7 @@
           <w:rFonts w:ascii="Arial" w:hAnsi="Arial" w:cs="Arial"/>
         </w:rPr>
         <w:pict w14:anchorId="745CD93D">
-          <v:rect id="_x0000_i1263" style="width:0;height:1.5pt" o:hralign="center" o:hrstd="t" o:hr="t" fillcolor="#a0a0a0" stroked="f"/>
+          <v:rect id="_x0000_i1035" style="width:0;height:1.5pt" o:hralign="center" o:hrstd="t" o:hr="t" fillcolor="#a0a0a0" stroked="f"/>
         </w:pict>
       </w:r>
     </w:p>
@@ -3200,7 +3200,7 @@
           <w:rFonts w:ascii="Arial" w:hAnsi="Arial" w:cs="Arial"/>
         </w:rPr>
         <w:pict w14:anchorId="2906EECD">
-          <v:rect id="_x0000_i1264" style="width:0;height:1.5pt" o:hralign="center" o:hrstd="t" o:hr="t" fillcolor="#a0a0a0" stroked="f"/>
+          <v:rect id="_x0000_i1036" style="width:0;height:1.5pt" o:hralign="center" o:hrstd="t" o:hr="t" fillcolor="#a0a0a0" stroked="f"/>
         </w:pict>
       </w:r>
     </w:p>
@@ -3371,7 +3371,7 @@
           <w:rFonts w:ascii="Arial" w:hAnsi="Arial" w:cs="Arial"/>
         </w:rPr>
         <w:pict w14:anchorId="0A03FFC6">
-          <v:rect id="_x0000_i1265" style="width:0;height:1.5pt" o:hralign="center" o:hrstd="t" o:hr="t" fillcolor="#a0a0a0" stroked="f"/>
+          <v:rect id="_x0000_i1037" style="width:0;height:1.5pt" o:hralign="center" o:hrstd="t" o:hr="t" fillcolor="#a0a0a0" stroked="f"/>
         </w:pict>
       </w:r>
     </w:p>
@@ -3593,7 +3593,7 @@
           <w:rFonts w:ascii="Arial" w:hAnsi="Arial" w:cs="Arial"/>
         </w:rPr>
         <w:pict w14:anchorId="5678057A">
-          <v:rect id="_x0000_i1266" style="width:0;height:1.5pt" o:hralign="center" o:hrstd="t" o:hr="t" fillcolor="#a0a0a0" stroked="f"/>
+          <v:rect id="_x0000_i1038" style="width:0;height:1.5pt" o:hralign="center" o:hrstd="t" o:hr="t" fillcolor="#a0a0a0" stroked="f"/>
         </w:pict>
       </w:r>
     </w:p>
@@ -3838,7 +3838,7 @@
           <w:rFonts w:ascii="Arial" w:hAnsi="Arial" w:cs="Arial"/>
         </w:rPr>
         <w:pict w14:anchorId="5576FC26">
-          <v:rect id="_x0000_i1267" style="width:0;height:1.5pt" o:hralign="center" o:hrstd="t" o:hr="t" fillcolor="#a0a0a0" stroked="f"/>
+          <v:rect id="_x0000_i1039" style="width:0;height:1.5pt" o:hralign="center" o:hrstd="t" o:hr="t" fillcolor="#a0a0a0" stroked="f"/>
         </w:pict>
       </w:r>
     </w:p>
@@ -4087,7 +4087,7 @@
           <w:rFonts w:ascii="Arial" w:hAnsi="Arial" w:cs="Arial"/>
         </w:rPr>
         <w:pict w14:anchorId="50B42E0C">
-          <v:rect id="_x0000_i1268" style="width:0;height:1.5pt" o:hralign="center" o:hrstd="t" o:hr="t" fillcolor="#a0a0a0" stroked="f"/>
+          <v:rect id="_x0000_i1040" style="width:0;height:1.5pt" o:hralign="center" o:hrstd="t" o:hr="t" fillcolor="#a0a0a0" stroked="f"/>
         </w:pict>
       </w:r>
     </w:p>
@@ -4314,7 +4314,7 @@
           <w:rFonts w:ascii="Arial" w:hAnsi="Arial" w:cs="Arial"/>
         </w:rPr>
         <w:pict w14:anchorId="2B575FF2">
-          <v:rect id="_x0000_i1269" style="width:0;height:1.5pt" o:hralign="center" o:hrstd="t" o:hr="t" fillcolor="#a0a0a0" stroked="f"/>
+          <v:rect id="_x0000_i1041" style="width:0;height:1.5pt" o:hralign="center" o:hrstd="t" o:hr="t" fillcolor="#a0a0a0" stroked="f"/>
         </w:pict>
       </w:r>
     </w:p>
@@ -4519,7 +4519,7 @@
           <w:rFonts w:ascii="Arial" w:hAnsi="Arial" w:cs="Arial"/>
         </w:rPr>
         <w:pict w14:anchorId="52089BBB">
-          <v:rect id="_x0000_i1270" style="width:0;height:1.5pt" o:hralign="center" o:hrstd="t" o:hr="t" fillcolor="#a0a0a0" stroked="f"/>
+          <v:rect id="_x0000_i1042" style="width:0;height:1.5pt" o:hralign="center" o:hrstd="t" o:hr="t" fillcolor="#a0a0a0" stroked="f"/>
         </w:pict>
       </w:r>
     </w:p>
@@ -4662,7 +4662,7 @@
           <w:rFonts w:ascii="Arial" w:hAnsi="Arial" w:cs="Arial"/>
         </w:rPr>
         <w:pict w14:anchorId="2F4B4674">
-          <v:rect id="_x0000_i1271" style="width:0;height:1.5pt" o:hralign="center" o:hrstd="t" o:hr="t" fillcolor="#a0a0a0" stroked="f"/>
+          <v:rect id="_x0000_i1043" style="width:0;height:1.5pt" o:hralign="center" o:hrstd="t" o:hr="t" fillcolor="#a0a0a0" stroked="f"/>
         </w:pict>
       </w:r>
     </w:p>
@@ -4896,7 +4896,7 @@
           <w:rFonts w:ascii="Arial" w:hAnsi="Arial" w:cs="Arial"/>
         </w:rPr>
         <w:pict w14:anchorId="75DA8ABB">
-          <v:rect id="_x0000_i1272" style="width:0;height:1.5pt" o:hralign="center" o:hrstd="t" o:hr="t" fillcolor="#a0a0a0" stroked="f"/>
+          <v:rect id="_x0000_i1044" style="width:0;height:1.5pt" o:hralign="center" o:hrstd="t" o:hr="t" fillcolor="#a0a0a0" stroked="f"/>
         </w:pict>
       </w:r>
     </w:p>
@@ -5014,7 +5014,7 @@
           <w:rFonts w:ascii="Arial" w:hAnsi="Arial" w:cs="Arial"/>
         </w:rPr>
         <w:pict w14:anchorId="5C0929C8">
-          <v:rect id="_x0000_i1273" style="width:0;height:1.5pt" o:hralign="center" o:hrstd="t" o:hr="t" fillcolor="#a0a0a0" stroked="f"/>
+          <v:rect id="_x0000_i1045" style="width:0;height:1.5pt" o:hralign="center" o:hrstd="t" o:hr="t" fillcolor="#a0a0a0" stroked="f"/>
         </w:pict>
       </w:r>
     </w:p>
@@ -5157,7 +5157,7 @@
           <w:rFonts w:ascii="Arial" w:hAnsi="Arial" w:cs="Arial"/>
         </w:rPr>
         <w:pict w14:anchorId="6694D59D">
-          <v:rect id="_x0000_i1274" style="width:0;height:1.5pt" o:hralign="center" o:hrstd="t" o:hr="t" fillcolor="#a0a0a0" stroked="f"/>
+          <v:rect id="_x0000_i1046" style="width:0;height:1.5pt" o:hralign="center" o:hrstd="t" o:hr="t" fillcolor="#a0a0a0" stroked="f"/>
         </w:pict>
       </w:r>
     </w:p>
@@ -5411,7 +5411,7 @@
           <w:rFonts w:ascii="Arial" w:hAnsi="Arial" w:cs="Arial"/>
         </w:rPr>
         <w:pict w14:anchorId="76D3E0D1">
-          <v:rect id="_x0000_i1275" style="width:0;height:1.5pt" o:hralign="center" o:hrstd="t" o:hr="t" fillcolor="#a0a0a0" stroked="f"/>
+          <v:rect id="_x0000_i1047" style="width:0;height:1.5pt" o:hralign="center" o:hrstd="t" o:hr="t" fillcolor="#a0a0a0" stroked="f"/>
         </w:pict>
       </w:r>
     </w:p>
@@ -5503,7 +5503,7 @@
           <w:rFonts w:ascii="Arial" w:hAnsi="Arial" w:cs="Arial"/>
         </w:rPr>
         <w:pict w14:anchorId="3964AAA3">
-          <v:rect id="_x0000_i1276" style="width:0;height:1.5pt" o:hralign="center" o:hrstd="t" o:hr="t" fillcolor="#a0a0a0" stroked="f"/>
+          <v:rect id="_x0000_i1048" style="width:0;height:1.5pt" o:hralign="center" o:hrstd="t" o:hr="t" fillcolor="#a0a0a0" stroked="f"/>
         </w:pict>
       </w:r>
     </w:p>
@@ -5765,7 +5765,7 @@
           <w:rFonts w:ascii="Arial" w:hAnsi="Arial" w:cs="Arial"/>
         </w:rPr>
         <w:pict w14:anchorId="65F2FAAA">
-          <v:rect id="_x0000_i1277" style="width:0;height:1.5pt" o:hralign="center" o:hrstd="t" o:hr="t" fillcolor="#a0a0a0" stroked="f"/>
+          <v:rect id="_x0000_i1049" style="width:0;height:1.5pt" o:hralign="center" o:hrstd="t" o:hr="t" fillcolor="#a0a0a0" stroked="f"/>
         </w:pict>
       </w:r>
     </w:p>
@@ -6040,7 +6040,7 @@
           <w:rFonts w:ascii="Arial" w:hAnsi="Arial" w:cs="Arial"/>
         </w:rPr>
         <w:pict w14:anchorId="35874897">
-          <v:rect id="_x0000_i1278" style="width:0;height:1.5pt" o:hralign="center" o:hrstd="t" o:hr="t" fillcolor="#a0a0a0" stroked="f"/>
+          <v:rect id="_x0000_i1050" style="width:0;height:1.5pt" o:hralign="center" o:hrstd="t" o:hr="t" fillcolor="#a0a0a0" stroked="f"/>
         </w:pict>
       </w:r>
     </w:p>
@@ -6173,7 +6173,7 @@
         </w:rPr>
         <w:lastRenderedPageBreak/>
         <w:pict w14:anchorId="21F893DC">
-          <v:rect id="_x0000_i1279" style="width:0;height:1.5pt" o:hralign="center" o:hrstd="t" o:hr="t" fillcolor="#a0a0a0" stroked="f"/>
+          <v:rect id="_x0000_i1051" style="width:0;height:1.5pt" o:hralign="center" o:hrstd="t" o:hr="t" fillcolor="#a0a0a0" stroked="f"/>
         </w:pict>
       </w:r>
     </w:p>
@@ -6318,7 +6318,7 @@
           <w:rFonts w:ascii="Arial" w:hAnsi="Arial" w:cs="Arial"/>
         </w:rPr>
         <w:pict w14:anchorId="584D31F1">
-          <v:rect id="_x0000_i1280" style="width:0;height:1.5pt" o:hralign="center" o:hrstd="t" o:hr="t" fillcolor="#a0a0a0" stroked="f"/>
+          <v:rect id="_x0000_i1052" style="width:0;height:1.5pt" o:hralign="center" o:hrstd="t" o:hr="t" fillcolor="#a0a0a0" stroked="f"/>
         </w:pict>
       </w:r>
     </w:p>
@@ -6520,7 +6520,7 @@
           <w:rFonts w:ascii="Arial" w:hAnsi="Arial" w:cs="Arial"/>
         </w:rPr>
         <w:pict w14:anchorId="2481CE48">
-          <v:rect id="_x0000_i1281" style="width:0;height:1.5pt" o:hralign="center" o:hrstd="t" o:hr="t" fillcolor="#a0a0a0" stroked="f"/>
+          <v:rect id="_x0000_i1053" style="width:0;height:1.5pt" o:hralign="center" o:hrstd="t" o:hr="t" fillcolor="#a0a0a0" stroked="f"/>
         </w:pict>
       </w:r>
     </w:p>
@@ -6730,7 +6730,7 @@
           <w:rFonts w:ascii="Arial" w:hAnsi="Arial" w:cs="Arial"/>
         </w:rPr>
         <w:pict w14:anchorId="22D370EE">
-          <v:rect id="_x0000_i1282" style="width:0;height:1.5pt" o:hralign="center" o:hrstd="t" o:hr="t" fillcolor="#a0a0a0" stroked="f"/>
+          <v:rect id="_x0000_i1054" style="width:0;height:1.5pt" o:hralign="center" o:hrstd="t" o:hr="t" fillcolor="#a0a0a0" stroked="f"/>
         </w:pict>
       </w:r>
     </w:p>
@@ -6917,7 +6917,7 @@
           <w:rFonts w:ascii="Arial" w:hAnsi="Arial" w:cs="Arial"/>
         </w:rPr>
         <w:pict w14:anchorId="24A02CF5">
-          <v:rect id="_x0000_i1283" style="width:0;height:1.5pt" o:hralign="center" o:hrstd="t" o:hr="t" fillcolor="#a0a0a0" stroked="f"/>
+          <v:rect id="_x0000_i1055" style="width:0;height:1.5pt" o:hralign="center" o:hrstd="t" o:hr="t" fillcolor="#a0a0a0" stroked="f"/>
         </w:pict>
       </w:r>
     </w:p>
@@ -7253,7 +7253,7 @@
           <w:rFonts w:ascii="Arial" w:hAnsi="Arial" w:cs="Arial"/>
         </w:rPr>
         <w:pict w14:anchorId="2FE98C52">
-          <v:rect id="_x0000_i1284" style="width:0;height:1.5pt" o:hralign="center" o:hrstd="t" o:hr="t" fillcolor="#a0a0a0" stroked="f"/>
+          <v:rect id="_x0000_i1056" style="width:0;height:1.5pt" o:hralign="center" o:hrstd="t" o:hr="t" fillcolor="#a0a0a0" stroked="f"/>
         </w:pict>
       </w:r>
     </w:p>
@@ -7702,7 +7702,7 @@
           <w:rFonts w:ascii="Arial" w:hAnsi="Arial" w:cs="Arial"/>
         </w:rPr>
         <w:pict w14:anchorId="2DB8ED0C">
-          <v:rect id="_x0000_i1285" style="width:0;height:1.5pt" o:hralign="center" o:hrstd="t" o:hr="t" fillcolor="#a0a0a0" stroked="f"/>
+          <v:rect id="_x0000_i1057" style="width:0;height:1.5pt" o:hralign="center" o:hrstd="t" o:hr="t" fillcolor="#a0a0a0" stroked="f"/>
         </w:pict>
       </w:r>
     </w:p>
@@ -8027,7 +8027,7 @@
           <w:rFonts w:ascii="Arial" w:hAnsi="Arial" w:cs="Arial"/>
         </w:rPr>
         <w:pict w14:anchorId="2A6AB53C">
-          <v:rect id="_x0000_i1286" style="width:0;height:1.5pt" o:hralign="center" o:hrstd="t" o:hr="t" fillcolor="#a0a0a0" stroked="f"/>
+          <v:rect id="_x0000_i1058" style="width:0;height:1.5pt" o:hralign="center" o:hrstd="t" o:hr="t" fillcolor="#a0a0a0" stroked="f"/>
         </w:pict>
       </w:r>
     </w:p>
@@ -8305,7 +8305,7 @@
           <w:rFonts w:ascii="Arial" w:hAnsi="Arial" w:cs="Arial"/>
         </w:rPr>
         <w:pict w14:anchorId="5AB78A66">
-          <v:rect id="_x0000_i1287" style="width:0;height:1.5pt" o:hralign="center" o:hrstd="t" o:hr="t" fillcolor="#a0a0a0" stroked="f"/>
+          <v:rect id="_x0000_i1059" style="width:0;height:1.5pt" o:hralign="center" o:hrstd="t" o:hr="t" fillcolor="#a0a0a0" stroked="f"/>
         </w:pict>
       </w:r>
     </w:p>
@@ -8646,7 +8646,7 @@
           <w:rFonts w:ascii="Arial" w:hAnsi="Arial" w:cs="Arial"/>
         </w:rPr>
         <w:pict w14:anchorId="4E454F75">
-          <v:rect id="_x0000_i1288" style="width:0;height:1.5pt" o:hralign="center" o:hrstd="t" o:hr="t" fillcolor="#a0a0a0" stroked="f"/>
+          <v:rect id="_x0000_i1060" style="width:0;height:1.5pt" o:hralign="center" o:hrstd="t" o:hr="t" fillcolor="#a0a0a0" stroked="f"/>
         </w:pict>
       </w:r>
     </w:p>
@@ -8850,7 +8850,7 @@
           <w:rFonts w:ascii="Arial" w:hAnsi="Arial" w:cs="Arial"/>
         </w:rPr>
         <w:pict w14:anchorId="540624A1">
-          <v:rect id="_x0000_i1289" style="width:0;height:1.5pt" o:hralign="center" o:hrstd="t" o:hr="t" fillcolor="#a0a0a0" stroked="f"/>
+          <v:rect id="_x0000_i1061" style="width:0;height:1.5pt" o:hralign="center" o:hrstd="t" o:hr="t" fillcolor="#a0a0a0" stroked="f"/>
         </w:pict>
       </w:r>
     </w:p>
@@ -10247,7 +10247,7 @@
           <w:rFonts w:ascii="Arial" w:hAnsi="Arial" w:cs="Arial"/>
         </w:rPr>
         <w:pict w14:anchorId="0AB80843">
-          <v:rect id="_x0000_i1290" style="width:0;height:1.5pt" o:hralign="center" o:hrstd="t" o:hr="t" fillcolor="#a0a0a0" stroked="f"/>
+          <v:rect id="_x0000_i1062" style="width:0;height:1.5pt" o:hralign="center" o:hrstd="t" o:hr="t" fillcolor="#a0a0a0" stroked="f"/>
         </w:pict>
       </w:r>
     </w:p>
@@ -14697,6 +14697,7 @@
   <w:style w:type="character" w:default="1" w:styleId="Absatz-Standardschriftart">
     <w:name w:val="Default Paragraph Font"/>
     <w:uiPriority w:val="1"/>
+    <w:semiHidden/>
     <w:unhideWhenUsed/>
   </w:style>
   <w:style w:type="table" w:default="1" w:styleId="NormaleTabelle">

</xml_diff>